<commit_message>
Marca en rojo el espacio de evidencia de Andres y reduce el reporte a 10 paginas
</commit_message>
<xml_diff>
--- a/Entregas/Entrega 3/Entregas a Enviar/Reporte_Entrega3_TelcoChurn.docx
+++ b/Entregas/Entrega 3/Entregas a Enviar/Reporte_Entrega3_TelcoChurn.docx
@@ -10,7 +10,7 @@
         <w:t xml:space="preserve">TelcoChurn — Entrega Final</w:t>
       </w:r>
     </w:p>
-    <w:bookmarkStart w:id="53" w:name="X2b570746afff01c00d03574e7c94c0372ac247b"/>
+    <w:bookmarkStart w:id="50" w:name="X2b570746afff01c00d03574e7c94c0372ac247b"/>
     <w:p>
       <w:pPr>
         <w:pStyle w:val="Heading1"/>
@@ -572,7 +572,7 @@
       <w:r>
         <w:drawing>
           <wp:inline>
-            <wp:extent cx="5334000" cy="2489200"/>
+            <wp:extent cx="3931919" cy="1834895"/>
             <wp:effectExtent b="0" l="0" r="0" t="0"/>
             <wp:docPr descr="Comparación de F1-score de los 9 experimentos registrados en MLflow" title="" id="12" name="Picture"/>
             <a:graphic>
@@ -593,7 +593,7 @@
                   <pic:spPr bwMode="auto">
                     <a:xfrm>
                       <a:off x="0" y="0"/>
-                      <a:ext cx="5334000" cy="2489200"/>
+                      <a:ext cx="3931919" cy="1834895"/>
                     </a:xfrm>
                     <a:prstGeom prst="rect">
                       <a:avLst/>
@@ -1210,7 +1210,7 @@
       <w:r>
         <w:drawing>
           <wp:inline>
-            <wp:extent cx="5334000" cy="4091679"/>
+            <wp:extent cx="3108960" cy="2384864"/>
             <wp:effectExtent b="0" l="0" r="0" t="0"/>
             <wp:docPr descr="Simulador de Escenarios — desplegado en http://3.90.218.62:8501" title="" id="18" name="Picture"/>
             <a:graphic>
@@ -1231,7 +1231,7 @@
                   <pic:spPr bwMode="auto">
                     <a:xfrm>
                       <a:off x="0" y="0"/>
-                      <a:ext cx="5334000" cy="4091679"/>
+                      <a:ext cx="3108960" cy="2384864"/>
                     </a:xfrm>
                     <a:prstGeom prst="rect">
                       <a:avLst/>
@@ -1310,7 +1310,7 @@
       <w:r>
         <w:drawing>
           <wp:inline>
-            <wp:extent cx="5334000" cy="4080282"/>
+            <wp:extent cx="3108960" cy="2378221"/>
             <wp:effectExtent b="0" l="0" r="0" t="0"/>
             <wp:docPr descr="Matriz de Priorización — 395 clientes en Zona Crítica sobre la muestra desplegada" title="" id="21" name="Picture"/>
             <a:graphic>
@@ -1331,7 +1331,7 @@
                   <pic:spPr bwMode="auto">
                     <a:xfrm>
                       <a:off x="0" y="0"/>
-                      <a:ext cx="5334000" cy="4080282"/>
+                      <a:ext cx="3108960" cy="2378221"/>
                     </a:xfrm>
                     <a:prstGeom prst="rect">
                       <a:avLst/>
@@ -1395,7 +1395,7 @@
       <w:r>
         <w:drawing>
           <wp:inline>
-            <wp:extent cx="5334000" cy="4000500"/>
+            <wp:extent cx="3108960" cy="2331720"/>
             <wp:effectExtent b="0" l="0" r="0" t="0"/>
             <wp:docPr descr="Factores de Influencia — Contract, tenure y TotalCharges como principales factores" title="" id="24" name="Picture"/>
             <a:graphic>
@@ -1416,7 +1416,7 @@
                   <pic:spPr bwMode="auto">
                     <a:xfrm>
                       <a:off x="0" y="0"/>
-                      <a:ext cx="5334000" cy="4000500"/>
+                      <a:ext cx="3108960" cy="2331720"/>
                     </a:xfrm>
                     <a:prstGeom prst="rect">
                       <a:avLst/>
@@ -1564,12 +1564,12 @@
     </w:p>
     <w:p>
       <w:pPr>
-        <w:pStyle w:val="CaptionedFigure"/>
+        <w:pStyle w:val="BodyText"/>
       </w:pPr>
       <w:r>
         <w:drawing>
           <wp:inline>
-            <wp:extent cx="5334000" cy="3658576"/>
+            <wp:extent cx="2834640" cy="1944272"/>
             <wp:effectExtent b="0" l="0" r="0" t="0"/>
             <wp:docPr descr="POST /api/v1/predict — request body con el esquema del cliente" title="" id="28" name="Picture"/>
             <a:graphic>
@@ -1590,7 +1590,7 @@
                   <pic:spPr bwMode="auto">
                     <a:xfrm>
                       <a:off x="0" y="0"/>
-                      <a:ext cx="5334000" cy="3658576"/>
+                      <a:ext cx="2834640" cy="1944272"/>
                     </a:xfrm>
                     <a:prstGeom prst="rect">
                       <a:avLst/>
@@ -1608,23 +1608,13 @@
           </wp:inline>
         </w:drawing>
       </w:r>
-    </w:p>
-    <w:p>
-      <w:pPr>
-        <w:pStyle w:val="ImageCaption"/>
-      </w:pPr>
-      <w:r>
-        <w:t xml:space="preserve">POST /api/v1/predict — request body con el esquema del cliente</w:t>
-      </w:r>
-    </w:p>
-    <w:p>
-      <w:pPr>
-        <w:pStyle w:val="CaptionedFigure"/>
-      </w:pPr>
+      <w:r>
+        <w:t xml:space="preserve"> </w:t>
+      </w:r>
       <w:r>
         <w:drawing>
           <wp:inline>
-            <wp:extent cx="5334000" cy="4074092"/>
+            <wp:extent cx="2834640" cy="2165089"/>
             <wp:effectExtent b="0" l="0" r="0" t="0"/>
             <wp:docPr descr="Respuesta 200 de la API — churn_probability y risk_label, URL de despliegue visible" title="" id="31" name="Picture"/>
             <a:graphic>
@@ -1645,7 +1635,7 @@
                   <pic:spPr bwMode="auto">
                     <a:xfrm>
                       <a:off x="0" y="0"/>
-                      <a:ext cx="5334000" cy="4074092"/>
+                      <a:ext cx="2834640" cy="2165089"/>
                     </a:xfrm>
                     <a:prstGeom prst="rect">
                       <a:avLst/>
@@ -1662,14 +1652,6 @@
             </a:graphic>
           </wp:inline>
         </w:drawing>
-      </w:r>
-    </w:p>
-    <w:p>
-      <w:pPr>
-        <w:pStyle w:val="ImageCaption"/>
-      </w:pPr>
-      <w:r>
-        <w:t xml:space="preserve">Respuesta 200 de la API — churn_probability y risk_label, URL de despliegue visible</w:t>
       </w:r>
     </w:p>
     <w:p>
@@ -2435,61 +2417,178 @@
     <w:p>
       <w:pPr>
         <w:pStyle w:val="BlockText"/>
+        <w:pBdr>
+          <w:top w:val="single" w:sz="18" w:space="4" w:color="FF0000"/>
+          <w:left w:val="single" w:sz="18" w:space="4" w:color="FF0000"/>
+          <w:bottom w:val="single" w:sz="18" w:space="4" w:color="FF0000"/>
+          <w:right w:val="single" w:sz="18" w:space="4" w:color="FF0000"/>
+        </w:pBdr>
+        <w:shd w:val="clear" w:color="auto" w:fill="FFE3E3"/>
+        <w:spacing w:before="200" w:after="80"/>
       </w:pPr>
       <w:r>
         <w:rPr>
           <w:b/>
           <w:bCs/>
+          <w:color w:val="C00000"/>
+          <w:sz w:val="24"/>
         </w:rPr>
         <w:t xml:space="preserve">ESPACIO PARA CAPTURA — Andrés Rueda.</w:t>
       </w:r>
       <w:r>
-        <w:t xml:space="preserve"> </w:t>
-      </w:r>
-      <w:r>
+        <w:rPr>
+          <w:b/>
+          <w:color w:val="C00000"/>
+          <w:sz w:val="24"/>
+        </w:rPr>
+        <w:t xml:space="preserve"> </w:t>
+      </w:r>
+      <w:r>
+        <w:rPr>
+          <w:b/>
+          <w:color w:val="C00000"/>
+          <w:sz w:val="24"/>
+        </w:rPr>
         <w:t xml:space="preserve">Pegar aquí el pantallazo de</w:t>
       </w:r>
       <w:r>
-        <w:t xml:space="preserve"> </w:t>
-      </w:r>
-      <w:r>
-        <w:rPr>
-          <w:rStyle w:val="VerbatimChar"/>
+        <w:rPr>
+          <w:b/>
+          <w:color w:val="C00000"/>
+          <w:sz w:val="24"/>
+        </w:rPr>
+        <w:t xml:space="preserve"> </w:t>
+      </w:r>
+      <w:r>
+        <w:rPr>
+          <w:rStyle w:val="VerbatimChar"/>
+          <w:b/>
+          <w:color w:val="C00000"/>
+          <w:sz w:val="24"/>
         </w:rPr>
         <w:t xml:space="preserve">git log --oneline -5</w:t>
       </w:r>
       <w:r>
-        <w:t xml:space="preserve"> </w:t>
-      </w:r>
-      <w:r>
+        <w:rPr>
+          <w:b/>
+          <w:color w:val="C00000"/>
+          <w:sz w:val="24"/>
+        </w:rPr>
+        <w:t xml:space="preserve"> </w:t>
+      </w:r>
+      <w:r>
+        <w:rPr>
+          <w:b/>
+          <w:color w:val="C00000"/>
+          <w:sz w:val="24"/>
+        </w:rPr>
         <w:t xml:space="preserve">o de</w:t>
       </w:r>
       <w:r>
-        <w:t xml:space="preserve"> </w:t>
-      </w:r>
-      <w:r>
-        <w:rPr>
-          <w:rStyle w:val="VerbatimChar"/>
+        <w:rPr>
+          <w:b/>
+          <w:color w:val="C00000"/>
+          <w:sz w:val="24"/>
+        </w:rPr>
+        <w:t xml:space="preserve"> </w:t>
+      </w:r>
+      <w:r>
+        <w:rPr>
+          <w:rStyle w:val="VerbatimChar"/>
+          <w:b/>
+          <w:color w:val="C00000"/>
+          <w:sz w:val="24"/>
         </w:rPr>
         <w:t xml:space="preserve">https://github.com/fduarteg2/ProjectChurn/commits/main</w:t>
       </w:r>
       <w:r>
-        <w:t xml:space="preserve"> </w:t>
-      </w:r>
-      <w:r>
+        <w:rPr>
+          <w:b/>
+          <w:color w:val="C00000"/>
+          <w:sz w:val="24"/>
+        </w:rPr>
+        <w:t xml:space="preserve"> </w:t>
+      </w:r>
+      <w:r>
+        <w:rPr>
+          <w:b/>
+          <w:color w:val="C00000"/>
+          <w:sz w:val="24"/>
+        </w:rPr>
         <w:t xml:space="preserve">mostrando los 2 commits de la Entrega 3 a su nombre (guía enviada en</w:t>
       </w:r>
       <w:r>
-        <w:t xml:space="preserve"> </w:t>
-      </w:r>
-      <w:r>
-        <w:rPr>
-          <w:rStyle w:val="VerbatimChar"/>
+        <w:rPr>
+          <w:b/>
+          <w:color w:val="C00000"/>
+          <w:sz w:val="24"/>
+        </w:rPr>
+        <w:t xml:space="preserve"> </w:t>
+      </w:r>
+      <w:r>
+        <w:rPr>
+          <w:rStyle w:val="VerbatimChar"/>
+          <w:b/>
+          <w:color w:val="C00000"/>
+          <w:sz w:val="24"/>
         </w:rPr>
         <w:t xml:space="preserve">Guia_Andres_Entrega3.zip</w:t>
       </w:r>
       <w:r>
+        <w:rPr>
+          <w:b/>
+          <w:color w:val="C00000"/>
+          <w:sz w:val="24"/>
+        </w:rPr>
         <w:t xml:space="preserve">). Al recibir la captura, actualizar también los hashes de commit en la tabla de la sección 7.</w:t>
+      </w:r>
+    </w:p>
+    <w:p>
+      <w:pPr>
+        <w:spacing w:before="40" w:after="80"/>
+        <w:jc w:val="center"/>
+        <w:pBdr>
+          <w:top w:val="single" w:sz="18" w:space="4" w:color="FF0000"/>
+          <w:left w:val="single" w:sz="18" w:space="4" w:color="FF0000"/>
+          <w:bottom w:val="single" w:sz="18" w:space="4" w:color="FF0000"/>
+          <w:right w:val="single" w:sz="18" w:space="4" w:color="FF0000"/>
+        </w:pBdr>
+        <w:shd w:val="clear" w:color="auto" w:fill="FFF5F5"/>
+      </w:pPr>
+      <w:r>
+        <w:rPr>
+          <w:b/>
+          <w:color w:val="C00000"/>
+          <w:sz w:val="26"/>
+        </w:rPr>
+        <w:t>▼  PEGAR AQUÍ EL PANTALLAZO DE ANDRÉS (commits / push)  ▼</w:t>
+      </w:r>
+    </w:p>
+    <w:p>
+      <w:pPr>
+        <w:pBdr>
+          <w:top w:val="single" w:sz="18" w:space="4" w:color="FF0000"/>
+          <w:left w:val="single" w:sz="18" w:space="4" w:color="FF0000"/>
+          <w:bottom w:val="single" w:sz="18" w:space="4" w:color="FF0000"/>
+          <w:right w:val="single" w:sz="18" w:space="4" w:color="FF0000"/>
+        </w:pBdr>
+        <w:shd w:val="clear" w:color="auto" w:fill="FFF5F5"/>
+        <w:spacing w:before="0" w:after="0"/>
+      </w:pPr>
+      <w:r>
+        <w:rPr>
+          <w:sz w:val="2"/>
+        </w:rPr>
+        <w:t xml:space="preserve"> </w:t>
+      </w:r>
+      <w:r>
+        <w:br/>
+      </w:r>
+      <w:r>
+        <w:br/>
+      </w:r>
+      <w:r>
+        <w:br/>
       </w:r>
     </w:p>
     <w:p>
@@ -2722,7 +2821,7 @@
     </w:p>
     <w:bookmarkEnd w:id="34"/>
     <w:bookmarkEnd w:id="35"/>
-    <w:bookmarkStart w:id="51" w:name="X86a7065fa80cc547932a62075fdee088628f41a"/>
+    <w:bookmarkStart w:id="48" w:name="X86a7065fa80cc547932a62075fdee088628f41a"/>
     <w:p>
       <w:pPr>
         <w:pStyle w:val="Heading2"/>
@@ -2777,12 +2876,12 @@
     </w:p>
     <w:p>
       <w:pPr>
-        <w:pStyle w:val="CaptionedFigure"/>
+        <w:pStyle w:val="BodyText"/>
       </w:pPr>
       <w:r>
         <w:drawing>
           <wp:inline>
-            <wp:extent cx="5334000" cy="2995041"/>
+            <wp:extent cx="2834640" cy="1591650"/>
             <wp:effectExtent b="0" l="0" r="0" t="0"/>
             <wp:docPr descr="Consola AWS EC2 — instancia mlflow-churn-server, IP pública 3.93.67.170, usuario voclabs/user5140187=Ferney_Duarte" title="" id="37" name="Picture"/>
             <a:graphic>
@@ -2803,7 +2902,7 @@
                   <pic:spPr bwMode="auto">
                     <a:xfrm>
                       <a:off x="0" y="0"/>
-                      <a:ext cx="5334000" cy="2995041"/>
+                      <a:ext cx="2834640" cy="1591650"/>
                     </a:xfrm>
                     <a:prstGeom prst="rect">
                       <a:avLst/>
@@ -2821,23 +2920,13 @@
           </wp:inline>
         </w:drawing>
       </w:r>
-    </w:p>
-    <w:p>
-      <w:pPr>
-        <w:pStyle w:val="ImageCaption"/>
-      </w:pPr>
-      <w:r>
-        <w:t xml:space="preserve">Consola AWS EC2 — instancia mlflow-churn-server, IP pública 3.93.67.170, usuario voclabs/user5140187=Ferney_Duarte</w:t>
-      </w:r>
-    </w:p>
-    <w:p>
-      <w:pPr>
-        <w:pStyle w:val="CaptionedFigure"/>
-      </w:pPr>
+      <w:r>
+        <w:t xml:space="preserve"> </w:t>
+      </w:r>
       <w:r>
         <w:drawing>
           <wp:inline>
-            <wp:extent cx="5334000" cy="2894948"/>
+            <wp:extent cx="2834640" cy="1538458"/>
             <wp:effectExtent b="0" l="0" r="0" t="0"/>
             <wp:docPr descr="Terminal SSH — usuario ubuntu, host ip-172-31-31-31, IP pública 3.93.67.170" title="" id="40" name="Picture"/>
             <a:graphic>
@@ -2858,7 +2947,7 @@
                   <pic:spPr bwMode="auto">
                     <a:xfrm>
                       <a:off x="0" y="0"/>
-                      <a:ext cx="5334000" cy="2894948"/>
+                      <a:ext cx="2834640" cy="1538458"/>
                     </a:xfrm>
                     <a:prstGeom prst="rect">
                       <a:avLst/>
@@ -2879,20 +2968,12 @@
     </w:p>
     <w:p>
       <w:pPr>
-        <w:pStyle w:val="ImageCaption"/>
-      </w:pPr>
-      <w:r>
-        <w:t xml:space="preserve">Terminal SSH — usuario ubuntu, host ip-172-31-31-31, IP pública 3.93.67.170</w:t>
-      </w:r>
-    </w:p>
-    <w:p>
-      <w:pPr>
-        <w:pStyle w:val="CaptionedFigure"/>
+        <w:pStyle w:val="BodyText"/>
       </w:pPr>
       <w:r>
         <w:drawing>
           <wp:inline>
-            <wp:extent cx="5334000" cy="3179884"/>
+            <wp:extent cx="2834640" cy="1689881"/>
             <wp:effectExtent b="0" l="0" r="0" t="0"/>
             <wp:docPr descr="UI de MLflow — listado de las 9 corridas del experimento telco_churn_entrega2" title="" id="43" name="Picture"/>
             <a:graphic>
@@ -2913,7 +2994,7 @@
                   <pic:spPr bwMode="auto">
                     <a:xfrm>
                       <a:off x="0" y="0"/>
-                      <a:ext cx="5334000" cy="3179884"/>
+                      <a:ext cx="2834640" cy="1689881"/>
                     </a:xfrm>
                     <a:prstGeom prst="rect">
                       <a:avLst/>
@@ -2931,23 +3012,13 @@
           </wp:inline>
         </w:drawing>
       </w:r>
-    </w:p>
-    <w:p>
-      <w:pPr>
-        <w:pStyle w:val="ImageCaption"/>
-      </w:pPr>
-      <w:r>
-        <w:t xml:space="preserve">UI de MLflow — listado de las 9 corridas del experimento telco_churn_entrega2</w:t>
-      </w:r>
-    </w:p>
-    <w:p>
-      <w:pPr>
-        <w:pStyle w:val="CaptionedFigure"/>
-      </w:pPr>
+      <w:r>
+        <w:t xml:space="preserve"> </w:t>
+      </w:r>
       <w:r>
         <w:drawing>
           <wp:inline>
-            <wp:extent cx="5334000" cy="3191282"/>
+            <wp:extent cx="2834640" cy="1695938"/>
             <wp:effectExtent b="0" l="0" r="0" t="0"/>
             <wp:docPr descr="Comparación de métricas entre corridas (parallel coordinates plot)" title="" id="46" name="Picture"/>
             <a:graphic>
@@ -2968,7 +3039,7 @@
                   <pic:spPr bwMode="auto">
                     <a:xfrm>
                       <a:off x="0" y="0"/>
-                      <a:ext cx="5334000" cy="3191282"/>
+                      <a:ext cx="2834640" cy="1695938"/>
                     </a:xfrm>
                     <a:prstGeom prst="rect">
                       <a:avLst/>
@@ -2987,71 +3058,8 @@
         </w:drawing>
       </w:r>
     </w:p>
-    <w:p>
-      <w:pPr>
-        <w:pStyle w:val="ImageCaption"/>
-      </w:pPr>
-      <w:r>
-        <w:t xml:space="preserve">Comparación de métricas entre corridas (parallel coordinates plot)</w:t>
-      </w:r>
-    </w:p>
-    <w:p>
-      <w:pPr>
-        <w:pStyle w:val="CaptionedFigure"/>
-      </w:pPr>
-      <w:r>
-        <w:drawing>
-          <wp:inline>
-            <wp:extent cx="5334000" cy="3886525"/>
-            <wp:effectExtent b="0" l="0" r="0" t="0"/>
-            <wp:docPr descr="Detalle de parámetros y métricas de las corridas comparadas" title="" id="49" name="Picture"/>
-            <a:graphic>
-              <a:graphicData uri="http://schemas.openxmlformats.org/drawingml/2006/picture">
-                <pic:pic>
-                  <pic:nvPicPr>
-                    <pic:cNvPr descr="pantallazos/e2_fig9_detalle_metricas.png" id="50" name="Picture"/>
-                    <pic:cNvPicPr>
-                      <a:picLocks noChangeArrowheads="1" noChangeAspect="1"/>
-                    </pic:cNvPicPr>
-                  </pic:nvPicPr>
-                  <pic:blipFill>
-                    <a:blip r:embed="rId48"/>
-                    <a:stretch>
-                      <a:fillRect/>
-                    </a:stretch>
-                  </pic:blipFill>
-                  <pic:spPr bwMode="auto">
-                    <a:xfrm>
-                      <a:off x="0" y="0"/>
-                      <a:ext cx="5334000" cy="3886525"/>
-                    </a:xfrm>
-                    <a:prstGeom prst="rect">
-                      <a:avLst/>
-                    </a:prstGeom>
-                    <a:noFill/>
-                    <a:ln w="9525">
-                      <a:noFill/>
-                      <a:headEnd/>
-                      <a:tailEnd/>
-                    </a:ln>
-                  </pic:spPr>
-                </pic:pic>
-              </a:graphicData>
-            </a:graphic>
-          </wp:inline>
-        </w:drawing>
-      </w:r>
-    </w:p>
-    <w:p>
-      <w:pPr>
-        <w:pStyle w:val="ImageCaption"/>
-      </w:pPr>
-      <w:r>
-        <w:t xml:space="preserve">Detalle de parámetros y métricas de las corridas comparadas</w:t>
-      </w:r>
-    </w:p>
-    <w:bookmarkEnd w:id="51"/>
-    <w:bookmarkStart w:id="52" w:name="principales-resultados-y-conclusiones"/>
+    <w:bookmarkEnd w:id="48"/>
+    <w:bookmarkStart w:id="49" w:name="principales-resultados-y-conclusiones"/>
     <w:p>
       <w:pPr>
         <w:pStyle w:val="Heading2"/>
@@ -3227,8 +3235,8 @@
         <w:t xml:space="preserve">Documentos adjuntos a esta entrega: Manual de Usuario del Tablero, Manual de Instalación, y Reporte de Trabajo en Equipo.</w:t>
       </w:r>
     </w:p>
-    <w:bookmarkEnd w:id="52"/>
-    <w:bookmarkEnd w:id="53"/>
+    <w:bookmarkEnd w:id="49"/>
+    <w:bookmarkEnd w:id="50"/>
     <w:sectPr>
       <w:footnotePr>
         <w:numRestart w:val="eachSect"/>

</xml_diff>